<commit_message>
Redesign portfolio in retro window style and add certifications
- Retro menu bar, window cards and dotted desk background
- Projects: SolarCORE, Sili-Tubig Clash and the Booth Evaluation System
- New Certifications page with Cisco Networking Academy certificates
- Projects & Designs page with design cards and descriptions
- About section with photo, education, languages, tools and interests
- Swipeable card rows on phones and light gray dark mode
- Update résumé project entry

Co-Authored-By: Claude Opus 5.5 <noreply@anthropic.com>
</commit_message>
<xml_diff>
--- a/Resume_Hazel_Sebastian.docx
+++ b/Resume_Hazel_Sebastian.docx
@@ -66,11 +66,6 @@
           <w:b/>
         </w:rPr>
         <w:t>University of La Salette</w:t>
-      </w:r>
-      <w:r>
-        <w:rPr>
-          <w:b/>
-        </w:rPr>
         <w:tab/>
         <w:t>Santiago City, Isabela</w:t>
       </w:r>
@@ -104,11 +99,6 @@
           <w:b/>
         </w:rPr>
         <w:t>San Sebastian Integrated School</w:t>
-      </w:r>
-      <w:r>
-        <w:rPr>
-          <w:b/>
-        </w:rPr>
         <w:tab/>
         <w:t>San Sebastian, Isabela</w:t>
       </w:r>
@@ -142,11 +132,6 @@
           <w:b/>
         </w:rPr>
         <w:t>San Sebastian Integrated School</w:t>
-      </w:r>
-      <w:r>
-        <w:rPr>
-          <w:b/>
-        </w:rPr>
         <w:tab/>
         <w:t>San Sebastian, Isabela</w:t>
       </w:r>
@@ -188,24 +173,11 @@
           <w:tab w:val="right" w:pos="10080"/>
         </w:tabs>
       </w:pPr>
-      <w:proofErr w:type="spellStart"/>
       <w:r>
         <w:rPr>
           <w:b/>
         </w:rPr>
-        <w:t>SolarCORE</w:t>
-      </w:r>
-      <w:proofErr w:type="spellEnd"/>
-      <w:r>
-        <w:rPr>
-          <w:b/>
-        </w:rPr>
-        <w:t>: GIS-Based Solar Installation Tracking System</w:t>
-      </w:r>
-      <w:r>
-        <w:rPr>
-          <w:b/>
-        </w:rPr>
+        <w:t>SolarCORE: GIS-Based Solar Installation Tracking System</w:t>
         <w:tab/>
         <w:t>Santiago City, Isabela</w:t>
       </w:r>
@@ -233,15 +205,7 @@
         <w:ind w:hanging="288"/>
       </w:pPr>
       <w:r>
-        <w:t xml:space="preserve">Designed the overall look of the </w:t>
-      </w:r>
-      <w:proofErr w:type="spellStart"/>
-      <w:r>
-        <w:t>SolarCORE</w:t>
-      </w:r>
-      <w:proofErr w:type="spellEnd"/>
-      <w:r>
-        <w:t xml:space="preserve"> website and created its logo.</w:t>
+        <w:t xml:space="preserve">Designed the overall look of the SolarCORE website and created its logo.</w:t>
       </w:r>
     </w:p>
     <w:p>
@@ -255,12 +219,7 @@
         <w:rPr>
           <w:b/>
         </w:rPr>
-        <w:t>Barangay Health Center Information Management System (BHCIMS)</w:t>
-      </w:r>
-      <w:r>
-        <w:rPr>
-          <w:b/>
-        </w:rPr>
+        <w:t>Booth Attendance, Evaluation &amp; E-Certificate System</w:t>
         <w:tab/>
         <w:t>Santiago City, Isabela</w:t>
       </w:r>
@@ -275,7 +234,7 @@
         <w:rPr>
           <w:i/>
         </w:rPr>
-        <w:t>Academic Project, University of La Salette | UI Designer</w:t>
+        <w:t>Skills Demonstration Project, University of La Salette | Designer &amp; Developer</w:t>
       </w:r>
       <w:r>
         <w:tab/>
@@ -288,7 +247,7 @@
         <w:ind w:hanging="288"/>
       </w:pPr>
       <w:r>
-        <w:t>Co-developed a health records system for a barangay health center and co-authored its user manual.</w:t>
+        <w:t>Built a web app for passkey check-in, evaluations, and e-certificates at the IT Skills Demonstration.</w:t>
       </w:r>
     </w:p>
     <w:p>
@@ -303,24 +262,8 @@
           <w:b/>
         </w:rPr>
         <w:t>Publication Materials and Social Media Graphics</w:t>
-      </w:r>
-      <w:r>
-        <w:rPr>
-          <w:b/>
-        </w:rPr>
         <w:tab/>
-      </w:r>
-      <w:r>
-        <w:rPr>
-          <w:b/>
-        </w:rPr>
-        <w:t xml:space="preserve">Ramon and Santiago City, </w:t>
-      </w:r>
-      <w:r>
-        <w:rPr>
-          <w:b/>
-        </w:rPr>
-        <w:t>Isabela</w:t>
+        <w:t xml:space="preserve">Ramon and Santiago City, Isabela</w:t>
       </w:r>
     </w:p>
     <w:p>
@@ -377,11 +320,6 @@
           <w:b/>
         </w:rPr>
         <w:t>CODE &amp; CONQUER Cagayan Valley: E-Sports Game Dev Challenge, DOST – Region 2</w:t>
-      </w:r>
-      <w:r>
-        <w:rPr>
-          <w:b/>
-        </w:rPr>
         <w:tab/>
         <w:t>September 2026</w:t>
       </w:r>
@@ -408,15 +346,7 @@
         <w:ind w:hanging="288"/>
       </w:pPr>
       <w:r>
-        <w:t xml:space="preserve">Supported a team of five in developing </w:t>
-      </w:r>
-      <w:proofErr w:type="spellStart"/>
-      <w:r>
-        <w:t>Sili</w:t>
-      </w:r>
-      <w:proofErr w:type="spellEnd"/>
-      <w:r>
-        <w:t>-Tubig Clash, a digital take on a Filipino street game.</w:t>
+        <w:t xml:space="preserve">Supported a team of five in developing Sili-Tubig Clash, a digital take on a Filipino street game.</w:t>
       </w:r>
     </w:p>
     <w:p>
@@ -430,26 +360,7 @@
         <w:rPr>
           <w:b/>
         </w:rPr>
-        <w:t xml:space="preserve">Gawad </w:t>
-      </w:r>
-      <w:proofErr w:type="spellStart"/>
-      <w:r>
-        <w:rPr>
-          <w:b/>
-        </w:rPr>
-        <w:t>Saletino</w:t>
-      </w:r>
-      <w:proofErr w:type="spellEnd"/>
-      <w:r>
-        <w:rPr>
-          <w:b/>
-        </w:rPr>
-        <w:t>: Special Citation for Volunteerism, University of La Salette</w:t>
-      </w:r>
-      <w:r>
-        <w:rPr>
-          <w:b/>
-        </w:rPr>
+        <w:t xml:space="preserve">Gawad Saletino: Special Citation for Volunteerism, University of La Salette</w:t>
         <w:tab/>
         <w:t>July 2026</w:t>
       </w:r>
@@ -488,11 +399,6 @@
           <w:b/>
         </w:rPr>
         <w:t>Local Council, College of Information Technology, University of La Salette</w:t>
-      </w:r>
-      <w:r>
-        <w:rPr>
-          <w:b/>
-        </w:rPr>
         <w:tab/>
         <w:t>Santiago City, Isabela</w:t>
       </w:r>
@@ -520,15 +426,7 @@
         <w:ind w:hanging="288"/>
       </w:pPr>
       <w:r>
-        <w:t xml:space="preserve">Led the council to the Gawad </w:t>
-      </w:r>
-      <w:proofErr w:type="spellStart"/>
-      <w:r>
-        <w:t>Saletino</w:t>
-      </w:r>
-      <w:proofErr w:type="spellEnd"/>
-      <w:r>
-        <w:t xml:space="preserve"> Outstanding Local Council award (July 2026).</w:t>
+        <w:t xml:space="preserve">Led the council to the Gawad Saletino Outstanding Local Council award (July 2026).</w:t>
       </w:r>
     </w:p>
     <w:p>
@@ -604,11 +502,6 @@
           <w:b/>
         </w:rPr>
         <w:t>Sangguniang Kabataan, Barangay Bantug</w:t>
-      </w:r>
-      <w:r>
-        <w:rPr>
-          <w:b/>
-        </w:rPr>
         <w:tab/>
         <w:t>Ramon, Isabela</w:t>
       </w:r>

</xml_diff>

<commit_message>
Add portfolio link to résumé contact line
Co-Authored-By: Claude Opus 5.5 <noreply@anthropic.com>
</commit_message>
<xml_diff>
--- a/Resume_Hazel_Sebastian.docx
+++ b/Resume_Hazel_Sebastian.docx
@@ -38,8 +38,23 @@
         <w:t>·</w:t>
       </w:r>
       <w:r>
-        <w:t xml:space="preserve">  sebastianhazel369@gmail.com</w:t>
+        <w:t xml:space="preserve">  sebastianhazel369@gmail.com  </w:t>
       </w:r>
+      <w:r>
+        <w:rPr>
+          <w:b/>
+          <w:bCs/>
+        </w:rPr>
+        <w:t>·</w:t>
+      </w:r>
+      <w:r>
+        <w:t xml:space="preserve">  </w:t>
+      </w:r>
+      <w:hyperlink r:id="rIdPortfolio" w:history="1">
+        <w:r>
+          <w:t>hazelbsebastian.github.io</w:t>
+        </w:r>
+      </w:hyperlink>
     </w:p>
     <w:p>
       <w:pPr>

</xml_diff>